<commit_message>
feat: implementar CRUD de publicaciones con JDBC
</commit_message>
<xml_diff>
--- a/Informe_Codificacion_JDBC_CRUD_RedSocial.docx
+++ b/Informe_Codificacion_JDBC_CRUD_RedSocial.docx
@@ -12,6 +12,7 @@
           <w:szCs w:val="48"/>
         </w:rPr>
       </w:pPr>
+      <w:proofErr w:type="spellStart"/>
       <w:r>
         <w:rPr>
           <w:rFonts w:ascii="Times New Roman" w:hAnsi="Times New Roman" w:cs="Times New Roman"/>
@@ -19,8 +20,49 @@
           <w:sz w:val="48"/>
           <w:szCs w:val="48"/>
         </w:rPr>
-        <w:t>Servicio Nacional De Aprendizaje – Sena</w:t>
+        <w:t>Servicio</w:t>
       </w:r>
+      <w:proofErr w:type="spellEnd"/>
+      <w:r>
+        <w:rPr>
+          <w:rFonts w:ascii="Times New Roman" w:hAnsi="Times New Roman" w:cs="Times New Roman"/>
+          <w:bCs/>
+          <w:sz w:val="48"/>
+          <w:szCs w:val="48"/>
+        </w:rPr>
+        <w:t xml:space="preserve"> Nacional De </w:t>
+      </w:r>
+      <w:proofErr w:type="spellStart"/>
+      <w:r>
+        <w:rPr>
+          <w:rFonts w:ascii="Times New Roman" w:hAnsi="Times New Roman" w:cs="Times New Roman"/>
+          <w:bCs/>
+          <w:sz w:val="48"/>
+          <w:szCs w:val="48"/>
+        </w:rPr>
+        <w:t>Aprendizaje</w:t>
+      </w:r>
+      <w:proofErr w:type="spellEnd"/>
+      <w:r>
+        <w:rPr>
+          <w:rFonts w:ascii="Times New Roman" w:hAnsi="Times New Roman" w:cs="Times New Roman"/>
+          <w:bCs/>
+          <w:sz w:val="48"/>
+          <w:szCs w:val="48"/>
+        </w:rPr>
+        <w:t xml:space="preserve"> – </w:t>
+      </w:r>
+      <w:proofErr w:type="spellStart"/>
+      <w:r>
+        <w:rPr>
+          <w:rFonts w:ascii="Times New Roman" w:hAnsi="Times New Roman" w:cs="Times New Roman"/>
+          <w:bCs/>
+          <w:sz w:val="48"/>
+          <w:szCs w:val="48"/>
+        </w:rPr>
+        <w:t>Sena</w:t>
+      </w:r>
+      <w:proofErr w:type="spellEnd"/>
     </w:p>
     <w:p>
       <w:pPr>
@@ -40,8 +82,38 @@
           <w:szCs w:val="48"/>
         </w:rPr>
         <w:br/>
-        <w:t>Análisis Y Desarrollo De Software – Adso</w:t>
       </w:r>
+      <w:proofErr w:type="spellStart"/>
+      <w:r>
+        <w:rPr>
+          <w:rFonts w:ascii="Times New Roman" w:hAnsi="Times New Roman" w:cs="Times New Roman"/>
+          <w:bCs/>
+          <w:sz w:val="48"/>
+          <w:szCs w:val="48"/>
+        </w:rPr>
+        <w:t>Análisis</w:t>
+      </w:r>
+      <w:proofErr w:type="spellEnd"/>
+      <w:r>
+        <w:rPr>
+          <w:rFonts w:ascii="Times New Roman" w:hAnsi="Times New Roman" w:cs="Times New Roman"/>
+          <w:bCs/>
+          <w:sz w:val="48"/>
+          <w:szCs w:val="48"/>
+        </w:rPr>
+        <w:t xml:space="preserve"> Y Desarrollo De Software – </w:t>
+      </w:r>
+      <w:proofErr w:type="spellStart"/>
+      <w:r>
+        <w:rPr>
+          <w:rFonts w:ascii="Times New Roman" w:hAnsi="Times New Roman" w:cs="Times New Roman"/>
+          <w:bCs/>
+          <w:sz w:val="48"/>
+          <w:szCs w:val="48"/>
+        </w:rPr>
+        <w:t>Adso</w:t>
+      </w:r>
+      <w:proofErr w:type="spellEnd"/>
       <w:r>
         <w:rPr>
           <w:rFonts w:ascii="Times New Roman" w:hAnsi="Times New Roman" w:cs="Times New Roman"/>
@@ -59,8 +131,58 @@
           <w:szCs w:val="48"/>
         </w:rPr>
         <w:br/>
-        <w:t>Codificación De Módulo Con Jdbc</w:t>
       </w:r>
+      <w:proofErr w:type="spellStart"/>
+      <w:r>
+        <w:rPr>
+          <w:rFonts w:ascii="Times New Roman" w:hAnsi="Times New Roman" w:cs="Times New Roman"/>
+          <w:bCs/>
+          <w:sz w:val="48"/>
+          <w:szCs w:val="48"/>
+        </w:rPr>
+        <w:t>Codificación</w:t>
+      </w:r>
+      <w:proofErr w:type="spellEnd"/>
+      <w:r>
+        <w:rPr>
+          <w:rFonts w:ascii="Times New Roman" w:hAnsi="Times New Roman" w:cs="Times New Roman"/>
+          <w:bCs/>
+          <w:sz w:val="48"/>
+          <w:szCs w:val="48"/>
+        </w:rPr>
+        <w:t xml:space="preserve"> De </w:t>
+      </w:r>
+      <w:proofErr w:type="spellStart"/>
+      <w:r>
+        <w:rPr>
+          <w:rFonts w:ascii="Times New Roman" w:hAnsi="Times New Roman" w:cs="Times New Roman"/>
+          <w:bCs/>
+          <w:sz w:val="48"/>
+          <w:szCs w:val="48"/>
+        </w:rPr>
+        <w:t>Módulo</w:t>
+      </w:r>
+      <w:proofErr w:type="spellEnd"/>
+      <w:r>
+        <w:rPr>
+          <w:rFonts w:ascii="Times New Roman" w:hAnsi="Times New Roman" w:cs="Times New Roman"/>
+          <w:bCs/>
+          <w:sz w:val="48"/>
+          <w:szCs w:val="48"/>
+        </w:rPr>
+        <w:t xml:space="preserve"> Con </w:t>
+      </w:r>
+      <w:proofErr w:type="spellStart"/>
+      <w:r>
+        <w:rPr>
+          <w:rFonts w:ascii="Times New Roman" w:hAnsi="Times New Roman" w:cs="Times New Roman"/>
+          <w:bCs/>
+          <w:sz w:val="48"/>
+          <w:szCs w:val="48"/>
+        </w:rPr>
+        <w:t>Jdbc</w:t>
+      </w:r>
+      <w:proofErr w:type="spellEnd"/>
       <w:r>
         <w:rPr>
           <w:rFonts w:ascii="Times New Roman" w:hAnsi="Times New Roman" w:cs="Times New Roman"/>
@@ -88,8 +210,58 @@
           <w:szCs w:val="48"/>
         </w:rPr>
         <w:br/>
-        <w:t>Módulo: Publicaciones / Inicio</w:t>
       </w:r>
+      <w:proofErr w:type="spellStart"/>
+      <w:r>
+        <w:rPr>
+          <w:rFonts w:ascii="Times New Roman" w:hAnsi="Times New Roman" w:cs="Times New Roman"/>
+          <w:bCs/>
+          <w:sz w:val="48"/>
+          <w:szCs w:val="48"/>
+        </w:rPr>
+        <w:t>Módulo</w:t>
+      </w:r>
+      <w:proofErr w:type="spellEnd"/>
+      <w:r>
+        <w:rPr>
+          <w:rFonts w:ascii="Times New Roman" w:hAnsi="Times New Roman" w:cs="Times New Roman"/>
+          <w:bCs/>
+          <w:sz w:val="48"/>
+          <w:szCs w:val="48"/>
+        </w:rPr>
+        <w:t xml:space="preserve">: </w:t>
+      </w:r>
+      <w:proofErr w:type="spellStart"/>
+      <w:r>
+        <w:rPr>
+          <w:rFonts w:ascii="Times New Roman" w:hAnsi="Times New Roman" w:cs="Times New Roman"/>
+          <w:bCs/>
+          <w:sz w:val="48"/>
+          <w:szCs w:val="48"/>
+        </w:rPr>
+        <w:t>Publicaciones</w:t>
+      </w:r>
+      <w:proofErr w:type="spellEnd"/>
+      <w:r>
+        <w:rPr>
+          <w:rFonts w:ascii="Times New Roman" w:hAnsi="Times New Roman" w:cs="Times New Roman"/>
+          <w:bCs/>
+          <w:sz w:val="48"/>
+          <w:szCs w:val="48"/>
+        </w:rPr>
+        <w:t xml:space="preserve"> / </w:t>
+      </w:r>
+      <w:proofErr w:type="spellStart"/>
+      <w:r>
+        <w:rPr>
+          <w:rFonts w:ascii="Times New Roman" w:hAnsi="Times New Roman" w:cs="Times New Roman"/>
+          <w:bCs/>
+          <w:sz w:val="48"/>
+          <w:szCs w:val="48"/>
+        </w:rPr>
+        <w:t>Inicio</w:t>
+      </w:r>
+      <w:proofErr w:type="spellEnd"/>
     </w:p>
     <w:p>
       <w:pPr>
@@ -109,7 +281,26 @@
           <w:szCs w:val="48"/>
         </w:rPr>
         <w:br/>
-        <w:t>Aprendiz: Jhovan D. Cordoba</w:t>
+      </w:r>
+      <w:proofErr w:type="spellStart"/>
+      <w:r>
+        <w:rPr>
+          <w:rFonts w:ascii="Times New Roman" w:hAnsi="Times New Roman" w:cs="Times New Roman"/>
+          <w:bCs/>
+          <w:sz w:val="48"/>
+          <w:szCs w:val="48"/>
+        </w:rPr>
+        <w:t>Aprendiz</w:t>
+      </w:r>
+      <w:proofErr w:type="spellEnd"/>
+      <w:r>
+        <w:rPr>
+          <w:rFonts w:ascii="Times New Roman" w:hAnsi="Times New Roman" w:cs="Times New Roman"/>
+          <w:bCs/>
+          <w:sz w:val="48"/>
+          <w:szCs w:val="48"/>
+        </w:rPr>
+        <w:t>: Jhovan D. Cordoba</w:t>
       </w:r>
     </w:p>
     <w:p>
@@ -169,7 +360,47 @@
     </w:p>
     <w:p>
       <w:r>
-        <w:t>El presente documento describe la implementación del módulo de publicaciones de la red social</w:t>
+        <w:t xml:space="preserve">El </w:t>
+      </w:r>
+      <w:proofErr w:type="spellStart"/>
+      <w:r>
+        <w:t>presente</w:t>
+      </w:r>
+      <w:proofErr w:type="spellEnd"/>
+      <w:r>
+        <w:t xml:space="preserve"> </w:t>
+      </w:r>
+      <w:proofErr w:type="spellStart"/>
+      <w:r>
+        <w:t>documento</w:t>
+      </w:r>
+      <w:proofErr w:type="spellEnd"/>
+      <w:r>
+        <w:t xml:space="preserve"> describe la </w:t>
+      </w:r>
+      <w:proofErr w:type="spellStart"/>
+      <w:r>
+        <w:t>implementación</w:t>
+      </w:r>
+      <w:proofErr w:type="spellEnd"/>
+      <w:r>
+        <w:t xml:space="preserve"> del </w:t>
+      </w:r>
+      <w:proofErr w:type="spellStart"/>
+      <w:r>
+        <w:t>módulo</w:t>
+      </w:r>
+      <w:proofErr w:type="spellEnd"/>
+      <w:r>
+        <w:t xml:space="preserve"> de </w:t>
+      </w:r>
+      <w:proofErr w:type="spellStart"/>
+      <w:r>
+        <w:t>publicaciones</w:t>
+      </w:r>
+      <w:proofErr w:type="spellEnd"/>
+      <w:r>
+        <w:t xml:space="preserve"> de la red social</w:t>
       </w:r>
       <w:r>
         <w:t xml:space="preserve"> </w:t>
@@ -181,7 +412,15 @@
         <w:t>33</w:t>
       </w:r>
       <w:r>
-        <w:t xml:space="preserve">del proyecto ADSO. La solución amplía el prototipo frontend previamente desarrollado incorporando una capa de acceso a datos </w:t>
+        <w:t xml:space="preserve">del </w:t>
+      </w:r>
+      <w:proofErr w:type="spellStart"/>
+      <w:r>
+        <w:t>proyecto</w:t>
+      </w:r>
+      <w:proofErr w:type="spellEnd"/>
+      <w:r>
+        <w:t xml:space="preserve"> ADSO. La solución amplía el prototipo frontend previamente desarrollado incorporando una capa de acceso a datos </w:t>
       </w:r>
       <w:r>
         <w:t>mediante JDBC y una base de datos MySQL. El módulo permite ejecutar las operaciones de inserción, consulta, actualización y eliminación de publicaciones (CRUD).</w:t>
@@ -440,8 +679,13 @@
         <w:t>git</w:t>
       </w:r>
       <w:r>
-        <w:t xml:space="preserve"> init</w:t>
+        <w:t xml:space="preserve"> </w:t>
       </w:r>
+      <w:proofErr w:type="spellStart"/>
+      <w:r>
+        <w:t>init</w:t>
+      </w:r>
+      <w:proofErr w:type="spellEnd"/>
     </w:p>
     <w:p>
       <w:r>
@@ -529,8 +773,13 @@
     </w:p>
     <w:p>
       <w:r>
-        <w:t>git add .</w:t>
+        <w:t xml:space="preserve">git </w:t>
       </w:r>
+      <w:proofErr w:type="gramStart"/>
+      <w:r>
+        <w:t>add .</w:t>
+      </w:r>
+      <w:proofErr w:type="gramEnd"/>
     </w:p>
     <w:p>
       <w:r>
@@ -573,7 +822,15 @@
     </w:p>
     <w:p>
       <w:r>
-        <w:t>git commit -m "feat: implementar CRUD de publicaciones con JDBC"</w:t>
+        <w:t xml:space="preserve">git commit -m "feat: implementar CRUD de </w:t>
+      </w:r>
+      <w:proofErr w:type="spellStart"/>
+      <w:r>
+        <w:t>publicaciones</w:t>
+      </w:r>
+      <w:proofErr w:type="spellEnd"/>
+      <w:r>
+        <w:t xml:space="preserve"> con JDBC"</w:t>
       </w:r>
     </w:p>
     <w:p>
@@ -741,9 +998,26 @@
     </w:p>
     <w:p>
       <w:pPr>
-        <w:pStyle w:val="Ttulo1"/>
+        <w:rPr>
+          <w:rFonts w:asciiTheme="majorHAnsi" w:eastAsiaTheme="majorEastAsia" w:hAnsiTheme="majorHAnsi" w:cstheme="majorBidi"/>
+          <w:b/>
+          <w:bCs/>
+          <w:color w:val="365F91" w:themeColor="accent1" w:themeShade="BF"/>
+          <w:sz w:val="28"/>
+          <w:szCs w:val="28"/>
+        </w:rPr>
       </w:pPr>
       <w:r>
+        <w:br w:type="page"/>
+      </w:r>
+    </w:p>
+    <w:p>
+      <w:pPr>
+        <w:pStyle w:val="Ttulo1"/>
+        <w:jc w:val="center"/>
+      </w:pPr>
+      <w:r>
+        <w:lastRenderedPageBreak/>
         <w:t>14. Conclusiones</w:t>
       </w:r>
     </w:p>
@@ -755,204 +1029,7 @@
         <w:t>ación en model, dao, service y util facilita el mantenimiento del software. El CRUD cumple con las operaciones fundamentales solicitadas para la gestión de publicaciones.</w:t>
       </w:r>
     </w:p>
-    <w:p>
-      <w:pPr>
-        <w:pStyle w:val="Ttulo1"/>
-      </w:pPr>
-      <w:r>
-        <w:t>15. Estructura de archivos</w:t>
-      </w:r>
-    </w:p>
-    <w:p>
-      <w:pPr>
-        <w:pStyle w:val="Listaconvietas"/>
-      </w:pPr>
-      <w:r>
-        <w:t>pom.xml</w:t>
-      </w:r>
-    </w:p>
-    <w:p>
-      <w:pPr>
-        <w:pStyle w:val="Listaconvietas"/>
-      </w:pPr>
-      <w:r>
-        <w:t>src/main/java/co/sena/redsocial/model/Usuario.java</w:t>
-      </w:r>
-    </w:p>
-    <w:p>
-      <w:pPr>
-        <w:pStyle w:val="Listaconvietas"/>
-      </w:pPr>
-      <w:r>
-        <w:t>src/main/java/co/sena/redsocial/model/Publicacion.java</w:t>
-      </w:r>
-    </w:p>
-    <w:p>
-      <w:pPr>
-        <w:pStyle w:val="Listaconvietas"/>
-      </w:pPr>
-      <w:r>
-        <w:t>src/main/java/co/sena/redsocial/util/ConexionBD.java</w:t>
-      </w:r>
-    </w:p>
-    <w:p>
-      <w:pPr>
-        <w:pStyle w:val="Listaconvietas"/>
-      </w:pPr>
-      <w:r>
-        <w:t>src/main/java/co/sena/redsocial/dao/PublicacionDAO.java</w:t>
-      </w:r>
-    </w:p>
-    <w:p>
-      <w:pPr>
-        <w:pStyle w:val="Listaconvietas"/>
-      </w:pPr>
-      <w:r>
-        <w:t>src/main/java/co/sena/redsocial/service/P</w:t>
-      </w:r>
-      <w:r>
-        <w:t>ublicacionService.java</w:t>
-      </w:r>
-    </w:p>
-    <w:p>
-      <w:pPr>
-        <w:pStyle w:val="Listaconvietas"/>
-      </w:pPr>
-      <w:r>
-        <w:t>src/main/java/co/sena/redsocial/app/RedSocialApp.java</w:t>
-      </w:r>
-    </w:p>
-    <w:p>
-      <w:pPr>
-        <w:pStyle w:val="Listaconvietas"/>
-      </w:pPr>
-      <w:r>
-        <w:t>sql/red_social_jdbc.sql</w:t>
-      </w:r>
-    </w:p>
-    <w:p>
-      <w:pPr>
-        <w:pStyle w:val="Listaconvietas"/>
-      </w:pPr>
-      <w:r>
-        <w:t>README.md</w:t>
-      </w:r>
-    </w:p>
-    <w:p>
-      <w:pPr>
-        <w:pStyle w:val="Ttulo1"/>
-      </w:pPr>
-      <w:r>
-        <w:t>16. Evidencias recomendadas para entregar</w:t>
-      </w:r>
-    </w:p>
-    <w:p>
-      <w:pPr>
-        <w:pStyle w:val="Listaconvietas"/>
-      </w:pPr>
-      <w:r>
-        <w:t>Proyecto Java abierto en el IDE.</w:t>
-      </w:r>
-    </w:p>
-    <w:p>
-      <w:pPr>
-        <w:pStyle w:val="Listaconvietas"/>
-      </w:pPr>
-      <w:r>
-        <w:t xml:space="preserve">Archivo ConexionBD.java mostrando la conexión JDBC (sin exponer una </w:t>
-      </w:r>
-      <w:r>
-        <w:t>contraseña real).</w:t>
-      </w:r>
-    </w:p>
-    <w:p>
-      <w:pPr>
-        <w:pStyle w:val="Listaconvietas"/>
-      </w:pPr>
-      <w:r>
-        <w:t>Base de datos red_social y tablas usuario/publicacion en MySQL Workbench.</w:t>
-      </w:r>
-    </w:p>
-    <w:p>
-      <w:pPr>
-        <w:pStyle w:val="Listaconvietas"/>
-      </w:pPr>
-      <w:r>
-        <w:t>Ejecución de INSERT.</w:t>
-      </w:r>
-    </w:p>
-    <w:p>
-      <w:pPr>
-        <w:pStyle w:val="Listaconvietas"/>
-      </w:pPr>
-      <w:r>
-        <w:t>Resultado de CONSULTA.</w:t>
-      </w:r>
-    </w:p>
-    <w:p>
-      <w:pPr>
-        <w:pStyle w:val="Listaconvietas"/>
-      </w:pPr>
-      <w:r>
-        <w:t>Resultado de UPDATE.</w:t>
-      </w:r>
-    </w:p>
-    <w:p>
-      <w:pPr>
-        <w:pStyle w:val="Listaconvietas"/>
-      </w:pPr>
-      <w:r>
-        <w:t>Resultado de DELETE.</w:t>
-      </w:r>
-    </w:p>
-    <w:p>
-      <w:pPr>
-        <w:pStyle w:val="Listaconvietas"/>
-      </w:pPr>
-      <w:r>
-        <w:t>git status.</w:t>
-      </w:r>
-    </w:p>
-    <w:p>
-      <w:pPr>
-        <w:pStyle w:val="Listaconvietas"/>
-      </w:pPr>
-      <w:r>
-        <w:t>git commit.</w:t>
-      </w:r>
-    </w:p>
-    <w:p>
-      <w:pPr>
-        <w:pStyle w:val="Listaconvietas"/>
-      </w:pPr>
-      <w:r>
-        <w:t>Repositorio de GitHub con el proyecto.</w:t>
-      </w:r>
-    </w:p>
-    <w:p>
-      <w:pPr>
-        <w:pStyle w:val="Ttulo1"/>
-      </w:pPr>
-      <w:r>
-        <w:t>17. Referencias</w:t>
-      </w:r>
-    </w:p>
-    <w:p>
-      <w:r>
-        <w:t>Documentación oficial de Java JDBC y paquetes java.sql.</w:t>
-      </w:r>
-    </w:p>
-    <w:p>
-      <w:r>
-        <w:t>Documentación oficial de MySQL Connector/J.</w:t>
-      </w:r>
-    </w:p>
-    <w:p>
-      <w:r>
-        <w:lastRenderedPageBreak/>
-        <w:t>Documentación oficial de Git y GitHub.</w:t>
-      </w:r>
-    </w:p>
+    <w:p/>
     <w:sectPr>
       <w:pgSz w:w="12240" w:h="15840"/>
       <w:pgMar w:top="1440" w:right="1440" w:bottom="1440" w:left="1440" w:header="720" w:footer="720" w:gutter="0"/>

</xml_diff>